<commit_message>
Refactor code structure for improved readability and maintainability; removed redundant code blocks and optimized existing functions.
</commit_message>
<xml_diff>
--- a/rep_reports/Betha_Odumo_performance_report.docx
+++ b/rep_reports/Betha_Odumo_performance_report.docx
@@ -60,7 +60,7 @@
           <w:color w:val="666666"/>
           <w:sz w:val="22"/>
         </w:rPr>
-        <w:t>February 1-21, 2026 (18 Working Days)</w:t>
+        <w:t>February 1-28, 2026 (24 Working Days — Full Month)</w:t>
       </w:r>
     </w:p>
     <w:p>
@@ -73,7 +73,7 @@
           <w:color w:val="999999"/>
           <w:sz w:val="18"/>
         </w:rPr>
-        <w:t>Generated: 2026-02-27 15:54:28</w:t>
+        <w:t>Generated: 2026-03-01 18:47:36</w:t>
       </w:r>
     </w:p>
     <w:p>
@@ -194,7 +194,7 @@
               <w:rPr>
                 <w:sz w:val="18"/>
               </w:rPr>
-              <w:t>KES 9,453,025</w:t>
+              <w:t>KES 13,451,533</w:t>
             </w:r>
           </w:p>
         </w:tc>
@@ -211,7 +211,7 @@
               <w:rPr>
                 <w:sz w:val="18"/>
               </w:rPr>
-              <w:t>▲ 33.2% vs team avg</w:t>
+              <w:t>▲ 43.4% vs team avg</w:t>
             </w:r>
           </w:p>
         </w:tc>
@@ -249,7 +249,7 @@
               <w:rPr>
                 <w:sz w:val="18"/>
               </w:rPr>
-              <w:t>KES 763,498</w:t>
+              <w:t>KES 1,123,301</w:t>
             </w:r>
           </w:p>
         </w:tc>
@@ -267,7 +267,7 @@
               <w:rPr>
                 <w:sz w:val="18"/>
               </w:rPr>
-              <w:t>17.6% of team total</w:t>
+              <w:t>19.5% of team total</w:t>
             </w:r>
           </w:p>
         </w:tc>
@@ -303,7 +303,7 @@
               <w:rPr>
                 <w:sz w:val="18"/>
               </w:rPr>
-              <w:t>8.1%</w:t>
+              <w:t>8.4%</w:t>
             </w:r>
           </w:p>
         </w:tc>
@@ -320,7 +320,7 @@
               <w:rPr>
                 <w:sz w:val="18"/>
               </w:rPr>
-              <w:t>Team avg: 8.7%</w:t>
+              <w:t>Team avg: 8.8%</w:t>
             </w:r>
           </w:p>
         </w:tc>
@@ -358,7 +358,7 @@
               <w:rPr>
                 <w:sz w:val="18"/>
               </w:rPr>
-              <w:t>12,927</w:t>
+              <w:t>18,368</w:t>
             </w:r>
           </w:p>
         </w:tc>
@@ -411,7 +411,7 @@
               <w:rPr>
                 <w:sz w:val="18"/>
               </w:rPr>
-              <w:t>KES 525,168</w:t>
+              <w:t>KES 560,481</w:t>
             </w:r>
           </w:p>
         </w:tc>
@@ -465,7 +465,7 @@
               <w:rPr>
                 <w:sz w:val="18"/>
               </w:rPr>
-              <w:t>KES 42,417</w:t>
+              <w:t>KES 46,804</w:t>
             </w:r>
           </w:p>
         </w:tc>
@@ -518,7 +518,7 @@
               <w:rPr>
                 <w:sz w:val="18"/>
               </w:rPr>
-              <w:t>19.0%</w:t>
+              <w:t>20.5%</w:t>
             </w:r>
           </w:p>
         </w:tc>
@@ -1116,6 +1116,116 @@
         <w:tc>
           <w:tcPr>
             <w:tcW w:type="dxa" w:w="1440"/>
+            <w:shd w:fill="ECF0F1"/>
+          </w:tcPr>
+          <w:p>
+            <w:pPr>
+              <w:jc w:val="center"/>
+            </w:pPr>
+            <w:r/>
+            <w:r>
+              <w:rPr>
+                <w:sz w:val="18"/>
+              </w:rPr>
+              <w:t>Week 4 (Feb 23-28)</w:t>
+            </w:r>
+          </w:p>
+        </w:tc>
+        <w:tc>
+          <w:tcPr>
+            <w:tcW w:type="dxa" w:w="1440"/>
+            <w:shd w:fill="ECF0F1"/>
+          </w:tcPr>
+          <w:p>
+            <w:pPr>
+              <w:jc w:val="center"/>
+            </w:pPr>
+            <w:r/>
+            <w:r>
+              <w:rPr>
+                <w:sz w:val="18"/>
+              </w:rPr>
+              <w:t>KES 3,998,508</w:t>
+            </w:r>
+          </w:p>
+        </w:tc>
+        <w:tc>
+          <w:tcPr>
+            <w:tcW w:type="dxa" w:w="1440"/>
+            <w:shd w:fill="ECF0F1"/>
+          </w:tcPr>
+          <w:p>
+            <w:pPr>
+              <w:jc w:val="center"/>
+            </w:pPr>
+            <w:r/>
+            <w:r>
+              <w:rPr>
+                <w:sz w:val="18"/>
+              </w:rPr>
+              <w:t>KES 359,803</w:t>
+            </w:r>
+          </w:p>
+        </w:tc>
+        <w:tc>
+          <w:tcPr>
+            <w:tcW w:type="dxa" w:w="1440"/>
+            <w:shd w:fill="ECF0F1"/>
+          </w:tcPr>
+          <w:p>
+            <w:pPr>
+              <w:jc w:val="center"/>
+            </w:pPr>
+            <w:r/>
+            <w:r>
+              <w:rPr>
+                <w:sz w:val="18"/>
+              </w:rPr>
+              <w:t>9.0%</w:t>
+            </w:r>
+          </w:p>
+        </w:tc>
+        <w:tc>
+          <w:tcPr>
+            <w:tcW w:type="dxa" w:w="1440"/>
+            <w:shd w:fill="ECF0F1"/>
+          </w:tcPr>
+          <w:p>
+            <w:pPr>
+              <w:jc w:val="center"/>
+            </w:pPr>
+            <w:r/>
+            <w:r>
+              <w:rPr>
+                <w:sz w:val="18"/>
+              </w:rPr>
+              <w:t>KES 666,418</w:t>
+            </w:r>
+          </w:p>
+        </w:tc>
+        <w:tc>
+          <w:tcPr>
+            <w:tcW w:type="dxa" w:w="1440"/>
+            <w:shd w:fill="ECF0F1"/>
+          </w:tcPr>
+          <w:p>
+            <w:pPr>
+              <w:jc w:val="center"/>
+            </w:pPr>
+            <w:r/>
+            <w:r>
+              <w:rPr>
+                <w:sz w:val="18"/>
+              </w:rPr>
+              <w:t>+9.6%</w:t>
+            </w:r>
+          </w:p>
+        </w:tc>
+      </w:tr>
+      <w:tr>
+        <w:tc>
+          <w:tcPr>
+            <w:tcW w:type="dxa" w:w="1440"/>
             <w:shd w:fill="D5F5E3"/>
           </w:tcPr>
           <w:p>
@@ -1128,7 +1238,7 @@
                 <w:b/>
                 <w:sz w:val="18"/>
               </w:rPr>
-              <w:t>TOTAL</w:t>
+              <w:t>FULL MONTH</w:t>
             </w:r>
           </w:p>
         </w:tc>
@@ -1147,7 +1257,7 @@
                 <w:b/>
                 <w:sz w:val="18"/>
               </w:rPr>
-              <w:t>KES 9,453,025</w:t>
+              <w:t>KES 13,451,533</w:t>
             </w:r>
           </w:p>
         </w:tc>
@@ -1166,7 +1276,7 @@
                 <w:b/>
                 <w:sz w:val="18"/>
               </w:rPr>
-              <w:t>KES 763,498</w:t>
+              <w:t>KES 1,123,301</w:t>
             </w:r>
           </w:p>
         </w:tc>
@@ -1185,7 +1295,7 @@
                 <w:b/>
                 <w:sz w:val="18"/>
               </w:rPr>
-              <w:t>8.1%</w:t>
+              <w:t>8.4%</w:t>
             </w:r>
           </w:p>
         </w:tc>
@@ -1204,7 +1314,7 @@
                 <w:b/>
                 <w:sz w:val="18"/>
               </w:rPr>
-              <w:t>KES 525,168</w:t>
+              <w:t>KES 560,481</w:t>
             </w:r>
           </w:p>
         </w:tc>
@@ -1223,7 +1333,7 @@
                 <w:b/>
                 <w:sz w:val="18"/>
               </w:rPr>
-              <w:t>+59.7%</w:t>
+              <w:t>+75.1%</w:t>
             </w:r>
           </w:p>
         </w:tc>
@@ -1262,7 +1372,16 @@
           <w:b/>
           <w:color w:val="27AE60"/>
         </w:rPr>
-        <w:t>📈 Consistent upward trend over 3 weeks (+59.7% overall)</w:t>
+        <w:t>▲ W3→W4: Sales increased by 9.6% (KES 3,649K → 3,999K)</w:t>
+      </w:r>
+    </w:p>
+    <w:p>
+      <w:r>
+        <w:rPr>
+          <w:b/>
+          <w:color w:val="27AE60"/>
+        </w:rPr>
+        <w:t>📈 Consistent upward trend across all 4 weeks (+75.1% overall)</w:t>
       </w:r>
     </w:p>
     <w:p>
@@ -1446,7 +1565,7 @@
               <w:rPr>
                 <w:sz w:val="18"/>
               </w:rPr>
-              <w:t>KES 8,967,025</w:t>
+              <w:t>KES 12,656,888</w:t>
             </w:r>
           </w:p>
         </w:tc>
@@ -1463,7 +1582,7 @@
               <w:rPr>
                 <w:sz w:val="18"/>
               </w:rPr>
-              <w:t>KES 664,794</w:t>
+              <w:t>KES 952,156</w:t>
             </w:r>
           </w:p>
         </w:tc>
@@ -1480,7 +1599,7 @@
               <w:rPr>
                 <w:sz w:val="18"/>
               </w:rPr>
-              <w:t>7.4%</w:t>
+              <w:t>7.5%</w:t>
             </w:r>
           </w:p>
         </w:tc>
@@ -1497,7 +1616,7 @@
               <w:rPr>
                 <w:sz w:val="18"/>
               </w:rPr>
-              <w:t>12,044</w:t>
+              <w:t>16,912</w:t>
             </w:r>
           </w:p>
         </w:tc>
@@ -1514,7 +1633,7 @@
               <w:rPr>
                 <w:sz w:val="18"/>
               </w:rPr>
-              <w:t>94.9%</w:t>
+              <w:t>94.1%</w:t>
             </w:r>
           </w:p>
         </w:tc>
@@ -1552,7 +1671,7 @@
               <w:rPr>
                 <w:sz w:val="18"/>
               </w:rPr>
-              <w:t>KES 395,960</w:t>
+              <w:t>KES 528,960</w:t>
             </w:r>
           </w:p>
         </w:tc>
@@ -1570,7 +1689,7 @@
               <w:rPr>
                 <w:sz w:val="18"/>
               </w:rPr>
-              <w:t>KES 72,158</w:t>
+              <w:t>KES 99,980</w:t>
             </w:r>
           </w:p>
         </w:tc>
@@ -1588,7 +1707,7 @@
               <w:rPr>
                 <w:sz w:val="18"/>
               </w:rPr>
-              <w:t>18.2%</w:t>
+              <w:t>18.9%</w:t>
             </w:r>
           </w:p>
         </w:tc>
@@ -1606,7 +1725,7 @@
               <w:rPr>
                 <w:sz w:val="18"/>
               </w:rPr>
-              <w:t>452</w:t>
+              <w:t>668</w:t>
             </w:r>
           </w:p>
         </w:tc>
@@ -1624,7 +1743,7 @@
               <w:rPr>
                 <w:sz w:val="18"/>
               </w:rPr>
-              <w:t>4.2%</w:t>
+              <w:t>3.9%</w:t>
             </w:r>
           </w:p>
         </w:tc>
@@ -1660,7 +1779,7 @@
               <w:rPr>
                 <w:sz w:val="18"/>
               </w:rPr>
-              <w:t>KES 73,580</w:t>
+              <w:t>KES 240,300</w:t>
             </w:r>
           </w:p>
         </w:tc>
@@ -1677,7 +1796,7 @@
               <w:rPr>
                 <w:sz w:val="18"/>
               </w:rPr>
-              <w:t>KES 21,366</w:t>
+              <w:t>KES 63,346</w:t>
             </w:r>
           </w:p>
         </w:tc>
@@ -1694,7 +1813,7 @@
               <w:rPr>
                 <w:sz w:val="18"/>
               </w:rPr>
-              <w:t>29.0%</w:t>
+              <w:t>26.4%</w:t>
             </w:r>
           </w:p>
         </w:tc>
@@ -1711,7 +1830,7 @@
               <w:rPr>
                 <w:sz w:val="18"/>
               </w:rPr>
-              <w:t>279</w:t>
+              <w:t>591</w:t>
             </w:r>
           </w:p>
         </w:tc>
@@ -1728,7 +1847,7 @@
               <w:rPr>
                 <w:sz w:val="18"/>
               </w:rPr>
-              <w:t>0.8%</w:t>
+              <w:t>1.8%</w:t>
             </w:r>
           </w:p>
         </w:tc>
@@ -1766,7 +1885,7 @@
               <w:rPr>
                 <w:sz w:val="18"/>
               </w:rPr>
-              <w:t>KES 16,460</w:t>
+              <w:t>KES 25,385</w:t>
             </w:r>
           </w:p>
         </w:tc>
@@ -1784,7 +1903,7 @@
               <w:rPr>
                 <w:sz w:val="18"/>
               </w:rPr>
-              <w:t>KES 5,180</w:t>
+              <w:t>KES 7,820</w:t>
             </w:r>
           </w:p>
         </w:tc>
@@ -1802,7 +1921,7 @@
               <w:rPr>
                 <w:sz w:val="18"/>
               </w:rPr>
-              <w:t>31.5%</w:t>
+              <w:t>30.8%</w:t>
             </w:r>
           </w:p>
         </w:tc>
@@ -1820,7 +1939,7 @@
               <w:rPr>
                 <w:sz w:val="18"/>
               </w:rPr>
-              <w:t>152</w:t>
+              <w:t>197</w:t>
             </w:r>
           </w:p>
         </w:tc>
@@ -1878,7 +1997,7 @@
                 <w:b/>
                 <w:sz w:val="18"/>
               </w:rPr>
-              <w:t>KES 9,453,025</w:t>
+              <w:t>KES 13,451,533</w:t>
             </w:r>
           </w:p>
         </w:tc>
@@ -1897,7 +2016,7 @@
                 <w:b/>
                 <w:sz w:val="18"/>
               </w:rPr>
-              <w:t>KES 763,498</w:t>
+              <w:t>KES 1,123,301</w:t>
             </w:r>
           </w:p>
         </w:tc>
@@ -1916,7 +2035,7 @@
                 <w:b/>
                 <w:sz w:val="18"/>
               </w:rPr>
-              <w:t>8.1%</w:t>
+              <w:t>8.4%</w:t>
             </w:r>
           </w:p>
         </w:tc>
@@ -1935,7 +2054,7 @@
                 <w:b/>
                 <w:sz w:val="18"/>
               </w:rPr>
-              <w:t>12,927</w:t>
+              <w:t>18,368</w:t>
             </w:r>
           </w:p>
         </w:tc>
@@ -1982,7 +2101,7 @@
           <w:color w:val="555555"/>
           <w:sz w:val="18"/>
         </w:rPr>
-        <w:t>W1: KES 2,163,840 → W2: KES 3,332,785 → W3: KES 3,470,400 → Overall: ▲60%</w:t>
+        <w:t>W1: KES 2,163,840 → W2: KES 3,332,785 → W3: KES 3,470,400 → W4: KES 3,689,863 → Overall: ▲71%</w:t>
       </w:r>
     </w:p>
     <w:p>
@@ -1998,7 +2117,7 @@
           <w:color w:val="555555"/>
           <w:sz w:val="18"/>
         </w:rPr>
-        <w:t>W1: KES 109,900 → W2: KES 134,210 → W3: KES 151,850 → Overall: ▲38%</w:t>
+        <w:t>W1: KES 109,900 → W2: KES 134,210 → W3: KES 151,850 → W4: KES 133,000 → Overall: ▲21%</w:t>
       </w:r>
     </w:p>
     <w:p>
@@ -2014,7 +2133,7 @@
           <w:color w:val="555555"/>
           <w:sz w:val="18"/>
         </w:rPr>
-        <w:t>W1: KES 5,790 → W2: KES 42,460 → W3: KES 25,330 → Overall: ▲337%</w:t>
+        <w:t>W1: KES 5,790 → W2: KES 42,460 → W3: KES 25,330 → W4: KES 166,720 → Overall: ▲2779%</w:t>
       </w:r>
     </w:p>
     <w:p>
@@ -2030,7 +2149,7 @@
           <w:color w:val="555555"/>
           <w:sz w:val="18"/>
         </w:rPr>
-        <w:t>W1: KES 4,640 → W2: KES 10,570 → W3: KES 1,250 → Overall: ▼73%</w:t>
+        <w:t>W1: KES 4,640 → W2: KES 10,570 → W3: KES 1,250 → W4: KES 8,925 → Overall: ▲92%</w:t>
       </w:r>
     </w:p>
     <w:p>
@@ -2058,7 +2177,7 @@
       <w:r>
         <w:drawing>
           <wp:inline xmlns:a="http://schemas.openxmlformats.org/drawingml/2006/main" xmlns:pic="http://schemas.openxmlformats.org/drawingml/2006/picture">
-            <wp:extent cx="5029200" cy="3430863"/>
+            <wp:extent cx="5029200" cy="3395289"/>
             <wp:docPr id="1" name="Picture 1"/>
             <wp:cNvGraphicFramePr>
               <a:graphicFrameLocks noChangeAspect="1"/>
@@ -2079,7 +2198,7 @@
                   <pic:spPr>
                     <a:xfrm>
                       <a:off x="0" y="0"/>
-                      <a:ext cx="5029200" cy="3430863"/>
+                      <a:ext cx="5029200" cy="3395289"/>
                     </a:xfrm>
                     <a:prstGeom prst="rect"/>
                   </pic:spPr>
@@ -2368,7 +2487,7 @@
               <w:rPr>
                 <w:sz w:val="18"/>
               </w:rPr>
-              <w:t>KES 19,339,020</w:t>
+              <w:t>KES 25,230,250</w:t>
             </w:r>
           </w:p>
         </w:tc>
@@ -2402,7 +2521,7 @@
               <w:rPr>
                 <w:sz w:val="18"/>
               </w:rPr>
-              <w:t>38.9%</w:t>
+              <w:t>38.4%</w:t>
             </w:r>
           </w:p>
         </w:tc>
@@ -2461,7 +2580,7 @@
                 <w:b/>
                 <w:sz w:val="18"/>
               </w:rPr>
-              <w:t>KES 9,453,025</w:t>
+              <w:t>KES 13,451,533</w:t>
             </w:r>
           </w:p>
         </w:tc>
@@ -2480,7 +2599,7 @@
                 <w:b/>
                 <w:sz w:val="18"/>
               </w:rPr>
-              <w:t>8.1%</w:t>
+              <w:t>8.4%</w:t>
             </w:r>
           </w:p>
         </w:tc>
@@ -2499,7 +2618,7 @@
                 <w:b/>
                 <w:sz w:val="18"/>
               </w:rPr>
-              <w:t>19.0%</w:t>
+              <w:t>20.5%</w:t>
             </w:r>
           </w:p>
         </w:tc>
@@ -2552,7 +2671,7 @@
               <w:rPr>
                 <w:sz w:val="18"/>
               </w:rPr>
-              <w:t>KES 8,456,260</w:t>
+              <w:t>KES 11,367,285</w:t>
             </w:r>
           </w:p>
         </w:tc>
@@ -2569,7 +2688,7 @@
               <w:rPr>
                 <w:sz w:val="18"/>
               </w:rPr>
-              <w:t>10.0%</w:t>
+              <w:t>9.4%</w:t>
             </w:r>
           </w:p>
         </w:tc>
@@ -2586,7 +2705,7 @@
               <w:rPr>
                 <w:sz w:val="18"/>
               </w:rPr>
-              <w:t>17.0%</w:t>
+              <w:t>17.3%</w:t>
             </w:r>
           </w:p>
         </w:tc>
@@ -2624,7 +2743,7 @@
               <w:rPr>
                 <w:sz w:val="18"/>
               </w:rPr>
-              <w:t>Stephen</w:t>
+              <w:t>Bonface Muriu</w:t>
             </w:r>
           </w:p>
         </w:tc>
@@ -2642,7 +2761,7 @@
               <w:rPr>
                 <w:sz w:val="18"/>
               </w:rPr>
-              <w:t>KES 4,067,316</w:t>
+              <w:t>KES 5,391,674</w:t>
             </w:r>
           </w:p>
         </w:tc>
@@ -2660,7 +2779,7 @@
               <w:rPr>
                 <w:sz w:val="18"/>
               </w:rPr>
-              <w:t>10.2%</w:t>
+              <w:t>14.9%</w:t>
             </w:r>
           </w:p>
         </w:tc>
@@ -2714,7 +2833,7 @@
               <w:rPr>
                 <w:sz w:val="18"/>
               </w:rPr>
-              <w:t>Bonface Muriu</w:t>
+              <w:t>Stephen</w:t>
             </w:r>
           </w:p>
         </w:tc>
@@ -2731,7 +2850,7 @@
               <w:rPr>
                 <w:sz w:val="18"/>
               </w:rPr>
-              <w:t>KES 3,948,909</w:t>
+              <w:t>KES 5,185,269</w:t>
             </w:r>
           </w:p>
         </w:tc>
@@ -2748,7 +2867,7 @@
               <w:rPr>
                 <w:sz w:val="18"/>
               </w:rPr>
-              <w:t>13.9%</w:t>
+              <w:t>10.3%</w:t>
             </w:r>
           </w:p>
         </w:tc>
@@ -2765,7 +2884,7 @@
               <w:rPr>
                 <w:sz w:val="18"/>
               </w:rPr>
-              <w:t>8.0%</w:t>
+              <w:t>7.9%</w:t>
             </w:r>
           </w:p>
         </w:tc>
@@ -2821,7 +2940,7 @@
               <w:rPr>
                 <w:sz w:val="18"/>
               </w:rPr>
-              <w:t>KES 2,614,482</w:t>
+              <w:t>KES 2,964,407</w:t>
             </w:r>
           </w:p>
         </w:tc>
@@ -2839,7 +2958,7 @@
               <w:rPr>
                 <w:sz w:val="18"/>
               </w:rPr>
-              <w:t>14.3%</w:t>
+              <w:t>14.5%</w:t>
             </w:r>
           </w:p>
         </w:tc>
@@ -2857,7 +2976,7 @@
               <w:rPr>
                 <w:sz w:val="18"/>
               </w:rPr>
-              <w:t>5.3%</w:t>
+              <w:t>4.5%</w:t>
             </w:r>
           </w:p>
         </w:tc>
@@ -2910,7 +3029,7 @@
               <w:rPr>
                 <w:sz w:val="18"/>
               </w:rPr>
-              <w:t>KES 1,790,725</w:t>
+              <w:t>KES 2,080,190</w:t>
             </w:r>
           </w:p>
         </w:tc>
@@ -2927,7 +3046,7 @@
               <w:rPr>
                 <w:sz w:val="18"/>
               </w:rPr>
-              <w:t>14.1%</w:t>
+              <w:t>15.2%</w:t>
             </w:r>
           </w:p>
         </w:tc>
@@ -2944,7 +3063,7 @@
               <w:rPr>
                 <w:sz w:val="18"/>
               </w:rPr>
-              <w:t>3.6%</w:t>
+              <w:t>3.2%</w:t>
             </w:r>
           </w:p>
         </w:tc>
@@ -3017,7 +3136,7 @@
           <w:color w:val="34495E"/>
           <w:sz w:val="20"/>
         </w:rPr>
-        <w:t>Sales 33% above team average - solid performance</w:t>
+        <w:t>Sales 43% above team average - solid performance</w:t>
       </w:r>
     </w:p>
     <w:p>
@@ -3050,10 +3169,22 @@
       </w:pPr>
       <w:r>
         <w:rPr>
+          <w:color w:val="34495E"/>
+          <w:sz w:val="20"/>
+        </w:rPr>
+        <w:t>W3→W4: Steady +9.6% (KES 3,649K → 3,999K)</w:t>
+      </w:r>
+    </w:p>
+    <w:p>
+      <w:pPr>
+        <w:pStyle w:val="ListBullet"/>
+      </w:pPr>
+      <w:r>
+        <w:rPr>
           <w:color w:val="27AE60"/>
           <w:sz w:val="20"/>
         </w:rPr>
-        <w:t>📈 Consistent upward trend over 3 weeks (+59.7% overall)</w:t>
+        <w:t>📈 Consistent upward trend all 4 weeks (+75.1% overall)</w:t>
       </w:r>
     </w:p>
     <w:p>
@@ -3065,7 +3196,7 @@
           <w:color w:val="34495E"/>
           <w:sz w:val="20"/>
         </w:rPr>
-        <w:t>General Hardware: 20.6% of dept, 7.4% margin</w:t>
+        <w:t>General Hardware: 22.0% of dept, 7.5% margin</w:t>
       </w:r>
     </w:p>
     <w:p>
@@ -3089,7 +3220,7 @@
           <w:color w:val="34495E"/>
           <w:sz w:val="20"/>
         </w:rPr>
-        <w:t>Best margin in ELECTRICALS: 31.5%</w:t>
+        <w:t>Best margin in ELECTRICALS: 30.8%</w:t>
       </w:r>
     </w:p>
     <w:p/>
@@ -3106,7 +3237,7 @@
         <w:pStyle w:val="ListBullet"/>
       </w:pPr>
       <w:r>
-        <w:t>Focus on higher-margin products to improve margin from 8.1% toward the team average of 8.7%.</w:t>
+        <w:t>Focus on higher-margin products to improve margin from 8.4% toward the team average of 8.8%.</w:t>
       </w:r>
     </w:p>
     <w:p>

</xml_diff>